<commit_message>
Found a mistake in a file and corrected it.
</commit_message>
<xml_diff>
--- a/Weekly reports/Week 1/Report.docx
+++ b/Weekly reports/Week 1/Report.docx
@@ -291,7 +291,49 @@
         <w:rPr>
           <w:lang w:val="en-US"/>
         </w:rPr>
-        <w:t xml:space="preserve"> In the Project folder are the code files, project part, of my project</w:t>
+        <w:t xml:space="preserve"> </w:t>
+      </w:r>
+      <w:r>
+        <w:rPr>
+          <w:lang w:val="en-US"/>
+        </w:rPr>
+        <w:t>In the Weekly reports folder</w:t>
+      </w:r>
+      <w:r>
+        <w:rPr>
+          <w:lang w:val="en-US"/>
+        </w:rPr>
+        <w:t>,</w:t>
+      </w:r>
+      <w:r>
+        <w:rPr>
+          <w:lang w:val="en-US"/>
+        </w:rPr>
+        <w:t xml:space="preserve"> I will create a folder for every week when the time for that week comes and in it the word file for that folder with the weekly report for it</w:t>
+      </w:r>
+      <w:r>
+        <w:rPr>
+          <w:lang w:val="en-US"/>
+        </w:rPr>
+        <w:t>; just like right now I created Week 1 and in it that word file Report</w:t>
+      </w:r>
+      <w:r>
+        <w:rPr>
+          <w:lang w:val="en-US"/>
+        </w:rPr>
+        <w:t>, that You are reading right now</w:t>
+      </w:r>
+      <w:r>
+        <w:rPr>
+          <w:lang w:val="en-US"/>
+        </w:rPr>
+        <w:t xml:space="preserve">. </w:t>
+      </w:r>
+      <w:r>
+        <w:rPr>
+          <w:lang w:val="en-US"/>
+        </w:rPr>
+        <w:t>In the Project folder are the code files, project part, of my project</w:t>
       </w:r>
       <w:r>
         <w:rPr>
@@ -310,6 +352,12 @@
           <w:lang w:val="en-US"/>
         </w:rPr>
         <w:t xml:space="preserve"> AubgAcademicTracker, as that is the name of the program I am planning to create</w:t>
+      </w:r>
+      <w:r>
+        <w:rPr>
+          <w:lang w:val="en-US"/>
+        </w:rPr>
+        <w:t>.</w:t>
       </w:r>
     </w:p>
     <w:sectPr>

</xml_diff>

<commit_message>
Finished my weekly report for the first week.
</commit_message>
<xml_diff>
--- a/Weekly reports/Week 1/Report.docx
+++ b/Weekly reports/Week 1/Report.docx
@@ -30,7 +30,31 @@
         <w:rPr>
           <w:lang w:val="en-US"/>
         </w:rPr>
-        <w:t xml:space="preserve"> I read the requirements for my project and began work on it.</w:t>
+        <w:t xml:space="preserve"> I read the requirements for </w:t>
+      </w:r>
+      <w:r>
+        <w:rPr>
+          <w:lang w:val="en-US"/>
+        </w:rPr>
+        <w:t>the</w:t>
+      </w:r>
+      <w:r>
+        <w:rPr>
+          <w:lang w:val="en-US"/>
+        </w:rPr>
+        <w:t xml:space="preserve"> project and began </w:t>
+      </w:r>
+      <w:r>
+        <w:rPr>
+          <w:lang w:val="en-US"/>
+        </w:rPr>
+        <w:t xml:space="preserve">to </w:t>
+      </w:r>
+      <w:r>
+        <w:rPr>
+          <w:lang w:val="en-US"/>
+        </w:rPr>
+        <w:t>work on it.</w:t>
       </w:r>
     </w:p>
     <w:p>
@@ -358,6 +382,498 @@
           <w:lang w:val="en-US"/>
         </w:rPr>
         <w:t>.</w:t>
+      </w:r>
+      <w:r>
+        <w:rPr>
+          <w:lang w:val="en-US"/>
+        </w:rPr>
+        <w:t xml:space="preserve"> The Home.razor file</w:t>
+      </w:r>
+      <w:r>
+        <w:rPr>
+          <w:lang w:val="en-US"/>
+        </w:rPr>
+        <w:t xml:space="preserve"> </w:t>
+      </w:r>
+      <w:r>
+        <w:rPr>
+          <w:lang w:val="en-US"/>
+        </w:rPr>
+        <w:t xml:space="preserve">represents the main </w:t>
+      </w:r>
+      <w:r>
+        <w:rPr>
+          <w:lang w:val="en-US"/>
+        </w:rPr>
+        <w:t>D</w:t>
+      </w:r>
+      <w:r>
+        <w:rPr>
+          <w:lang w:val="en-US"/>
+        </w:rPr>
+        <w:t>ashboard</w:t>
+      </w:r>
+      <w:r>
+        <w:rPr>
+          <w:lang w:val="en-US"/>
+        </w:rPr>
+        <w:t xml:space="preserve"> page of the application</w:t>
+      </w:r>
+      <w:r>
+        <w:rPr>
+          <w:lang w:val="en-US"/>
+        </w:rPr>
+        <w:t>.</w:t>
+      </w:r>
+      <w:r>
+        <w:rPr>
+          <w:lang w:val="en-US"/>
+        </w:rPr>
+        <w:t xml:space="preserve"> It is the first page that the user sees. </w:t>
+      </w:r>
+      <w:r>
+        <w:rPr>
+          <w:lang w:val="en-US"/>
+        </w:rPr>
+        <w:t>The Courses.razor file represents</w:t>
+      </w:r>
+      <w:r>
+        <w:rPr>
+          <w:lang w:val="en-US"/>
+        </w:rPr>
+        <w:t xml:space="preserve"> the page which displays the</w:t>
+      </w:r>
+      <w:r>
+        <w:rPr>
+          <w:lang w:val="en-US"/>
+        </w:rPr>
+        <w:t xml:space="preserve"> courses entered by the user.</w:t>
+      </w:r>
+      <w:r>
+        <w:rPr>
+          <w:lang w:val="en-US"/>
+        </w:rPr>
+        <w:t xml:space="preserve"> </w:t>
+      </w:r>
+      <w:r>
+        <w:rPr>
+          <w:lang w:val="en-US"/>
+        </w:rPr>
+        <w:t>The page reads the courses</w:t>
+      </w:r>
+      <w:r>
+        <w:rPr>
+          <w:lang w:val="en-US"/>
+        </w:rPr>
+        <w:t xml:space="preserve"> from the CourseService</w:t>
+      </w:r>
+      <w:r>
+        <w:rPr>
+          <w:lang w:val="en-US"/>
+        </w:rPr>
+        <w:t xml:space="preserve"> and creates one table</w:t>
+      </w:r>
+      <w:r>
+        <w:rPr>
+          <w:lang w:val="en-US"/>
+        </w:rPr>
+        <w:t xml:space="preserve"> row</w:t>
+      </w:r>
+      <w:r>
+        <w:rPr>
+          <w:lang w:val="en-US"/>
+        </w:rPr>
+        <w:t xml:space="preserve"> for every course in the list</w:t>
+      </w:r>
+      <w:r>
+        <w:rPr>
+          <w:lang w:val="en-US"/>
+        </w:rPr>
+        <w:t>.</w:t>
+      </w:r>
+      <w:r>
+        <w:rPr>
+          <w:lang w:val="en-US"/>
+        </w:rPr>
+        <w:t xml:space="preserve"> </w:t>
+      </w:r>
+      <w:r>
+        <w:rPr>
+          <w:lang w:val="en-US"/>
+        </w:rPr>
+        <w:t>AddCourse.razor</w:t>
+      </w:r>
+      <w:r>
+        <w:rPr>
+          <w:lang w:val="en-US"/>
+        </w:rPr>
+        <w:t xml:space="preserve"> contains the form</w:t>
+      </w:r>
+      <w:r>
+        <w:rPr>
+          <w:lang w:val="en-US"/>
+        </w:rPr>
+        <w:t xml:space="preserve"> used for adding</w:t>
+      </w:r>
+      <w:r>
+        <w:rPr>
+          <w:lang w:val="en-US"/>
+        </w:rPr>
+        <w:t xml:space="preserve"> a new course</w:t>
+      </w:r>
+      <w:r>
+        <w:rPr>
+          <w:lang w:val="en-US"/>
+        </w:rPr>
+        <w:t>.</w:t>
+      </w:r>
+      <w:r>
+        <w:rPr>
+          <w:lang w:val="en-US"/>
+        </w:rPr>
+        <w:t xml:space="preserve"> The form allows the user to </w:t>
+      </w:r>
+      <w:r>
+        <w:rPr>
+          <w:lang w:val="en-US"/>
+        </w:rPr>
+        <w:t>enter</w:t>
+      </w:r>
+      <w:r>
+        <w:rPr>
+          <w:lang w:val="en-US"/>
+        </w:rPr>
+        <w:t xml:space="preserve"> the course code,</w:t>
+      </w:r>
+      <w:r>
+        <w:rPr>
+          <w:lang w:val="en-US"/>
+        </w:rPr>
+        <w:t xml:space="preserve"> course name</w:t>
+      </w:r>
+      <w:r>
+        <w:rPr>
+          <w:lang w:val="en-US"/>
+        </w:rPr>
+        <w:t>, number of credits</w:t>
+      </w:r>
+      <w:r>
+        <w:rPr>
+          <w:lang w:val="en-US"/>
+        </w:rPr>
+        <w:t>, and semester, while</w:t>
+      </w:r>
+      <w:r>
+        <w:rPr>
+          <w:lang w:val="en-US"/>
+        </w:rPr>
+        <w:t xml:space="preserve"> the grade is selected</w:t>
+      </w:r>
+      <w:r>
+        <w:rPr>
+          <w:lang w:val="en-US"/>
+        </w:rPr>
+        <w:t xml:space="preserve"> from a dropdown list</w:t>
+      </w:r>
+      <w:r>
+        <w:rPr>
+          <w:lang w:val="en-US"/>
+        </w:rPr>
+        <w:t xml:space="preserve"> containing the supported grades.</w:t>
+      </w:r>
+      <w:r>
+        <w:rPr>
+          <w:lang w:val="en-US"/>
+        </w:rPr>
+        <w:t xml:space="preserve"> Course.cs</w:t>
+      </w:r>
+      <w:r>
+        <w:rPr>
+          <w:lang w:val="en-US"/>
+        </w:rPr>
+        <w:t xml:space="preserve"> is the model class</w:t>
+      </w:r>
+      <w:r>
+        <w:rPr>
+          <w:lang w:val="en-US"/>
+        </w:rPr>
+        <w:t xml:space="preserve"> representing</w:t>
+      </w:r>
+      <w:r>
+        <w:rPr>
+          <w:lang w:val="en-US"/>
+        </w:rPr>
+        <w:t xml:space="preserve"> one academic course.</w:t>
+      </w:r>
+      <w:r>
+        <w:rPr>
+          <w:lang w:val="en-US"/>
+        </w:rPr>
+        <w:t xml:space="preserve"> Every Course object</w:t>
+      </w:r>
+      <w:r>
+        <w:rPr>
+          <w:lang w:val="en-US"/>
+        </w:rPr>
+        <w:t xml:space="preserve"> contains an id,</w:t>
+      </w:r>
+      <w:r>
+        <w:rPr>
+          <w:lang w:val="en-US"/>
+        </w:rPr>
+        <w:t xml:space="preserve"> course code</w:t>
+      </w:r>
+      <w:r>
+        <w:rPr>
+          <w:lang w:val="en-US"/>
+        </w:rPr>
+        <w:t>, course name</w:t>
+      </w:r>
+      <w:r>
+        <w:rPr>
+          <w:lang w:val="en-US"/>
+        </w:rPr>
+        <w:t xml:space="preserve">, number of </w:t>
+      </w:r>
+      <w:r>
+        <w:rPr>
+          <w:lang w:val="en-US"/>
+        </w:rPr>
+        <w:t>credits</w:t>
+      </w:r>
+      <w:r>
+        <w:rPr>
+          <w:lang w:val="en-US"/>
+        </w:rPr>
+        <w:t>, grade, and semester</w:t>
+      </w:r>
+      <w:r>
+        <w:rPr>
+          <w:lang w:val="en-US"/>
+        </w:rPr>
+        <w:t>.</w:t>
+      </w:r>
+      <w:r>
+        <w:rPr>
+          <w:lang w:val="en-US"/>
+        </w:rPr>
+        <w:t xml:space="preserve"> CourseService.cs</w:t>
+      </w:r>
+      <w:r>
+        <w:rPr>
+          <w:lang w:val="en-US"/>
+        </w:rPr>
+        <w:t xml:space="preserve"> is responsible for</w:t>
+      </w:r>
+      <w:r>
+        <w:rPr>
+          <w:lang w:val="en-US"/>
+        </w:rPr>
+        <w:t xml:space="preserve"> managing</w:t>
+      </w:r>
+      <w:r>
+        <w:rPr>
+          <w:lang w:val="en-US"/>
+        </w:rPr>
+        <w:t xml:space="preserve"> the courses</w:t>
+      </w:r>
+      <w:r>
+        <w:rPr>
+          <w:lang w:val="en-US"/>
+        </w:rPr>
+        <w:t xml:space="preserve"> currently entered</w:t>
+      </w:r>
+      <w:r>
+        <w:rPr>
+          <w:lang w:val="en-US"/>
+        </w:rPr>
+        <w:t xml:space="preserve"> into the application.</w:t>
+      </w:r>
+      <w:r>
+        <w:rPr>
+          <w:lang w:val="en-US"/>
+        </w:rPr>
+        <w:t xml:space="preserve"> It contains a list of Course objects</w:t>
+      </w:r>
+      <w:r>
+        <w:rPr>
+          <w:lang w:val="en-US"/>
+        </w:rPr>
+        <w:t xml:space="preserve"> and provides the AddCourse method</w:t>
+      </w:r>
+      <w:r>
+        <w:rPr>
+          <w:lang w:val="en-US"/>
+        </w:rPr>
+        <w:t>, which assigns an id to a new course</w:t>
+      </w:r>
+      <w:r>
+        <w:rPr>
+          <w:lang w:val="en-US"/>
+        </w:rPr>
+        <w:t xml:space="preserve"> and adds it to </w:t>
+      </w:r>
+      <w:r>
+        <w:rPr>
+          <w:lang w:val="en-US"/>
+        </w:rPr>
+        <w:t>the</w:t>
+      </w:r>
+      <w:r>
+        <w:rPr>
+          <w:lang w:val="en-US"/>
+        </w:rPr>
+        <w:t xml:space="preserve"> list.</w:t>
+      </w:r>
+      <w:r>
+        <w:rPr>
+          <w:lang w:val="en-US"/>
+        </w:rPr>
+        <w:t xml:space="preserve"> NavMenu</w:t>
+      </w:r>
+      <w:r>
+        <w:rPr>
+          <w:lang w:val="en-US"/>
+        </w:rPr>
+        <w:t>.razor</w:t>
+      </w:r>
+      <w:r>
+        <w:rPr>
+          <w:lang w:val="en-US"/>
+        </w:rPr>
+        <w:t xml:space="preserve"> controls</w:t>
+      </w:r>
+      <w:r>
+        <w:rPr>
+          <w:lang w:val="en-US"/>
+        </w:rPr>
+        <w:t xml:space="preserve"> the navigation</w:t>
+      </w:r>
+      <w:r>
+        <w:rPr>
+          <w:lang w:val="en-US"/>
+        </w:rPr>
+        <w:t xml:space="preserve"> menu shown</w:t>
+      </w:r>
+      <w:r>
+        <w:rPr>
+          <w:lang w:val="en-US"/>
+        </w:rPr>
+        <w:t xml:space="preserve"> on the left</w:t>
+      </w:r>
+      <w:r>
+        <w:rPr>
+          <w:lang w:val="en-US"/>
+        </w:rPr>
+        <w:t xml:space="preserve"> side of the application</w:t>
+      </w:r>
+      <w:r>
+        <w:rPr>
+          <w:lang w:val="en-US"/>
+        </w:rPr>
+        <w:t>.</w:t>
+      </w:r>
+      <w:r>
+        <w:rPr>
+          <w:lang w:val="en-US"/>
+        </w:rPr>
+        <w:t xml:space="preserve"> I modified it so that </w:t>
+      </w:r>
+      <w:r>
+        <w:rPr>
+          <w:lang w:val="en-US"/>
+        </w:rPr>
+        <w:t>the user can navigate</w:t>
+      </w:r>
+      <w:r>
+        <w:rPr>
+          <w:lang w:val="en-US"/>
+        </w:rPr>
+        <w:t xml:space="preserve"> to the Dashboard and</w:t>
+      </w:r>
+      <w:r>
+        <w:rPr>
+          <w:lang w:val="en-US"/>
+        </w:rPr>
+        <w:t xml:space="preserve"> Courses page</w:t>
+      </w:r>
+      <w:r>
+        <w:rPr>
+          <w:lang w:val="en-US"/>
+        </w:rPr>
+        <w:t>s</w:t>
+      </w:r>
+      <w:r>
+        <w:rPr>
+          <w:lang w:val="en-US"/>
+        </w:rPr>
+        <w:t>.</w:t>
+      </w:r>
+      <w:r>
+        <w:rPr>
+          <w:lang w:val="en-US"/>
+        </w:rPr>
+        <w:t xml:space="preserve"> Altogether, until now my project has</w:t>
+      </w:r>
+      <w:r>
+        <w:rPr>
+          <w:lang w:val="en-US"/>
+        </w:rPr>
+        <w:t xml:space="preserve"> a basic separation of responsibilities</w:t>
+      </w:r>
+      <w:r>
+        <w:rPr>
+          <w:lang w:val="en-US"/>
+        </w:rPr>
+        <w:t>.</w:t>
+      </w:r>
+      <w:r>
+        <w:rPr>
+          <w:lang w:val="en-US"/>
+        </w:rPr>
+        <w:t xml:space="preserve"> The Course class represents the data</w:t>
+      </w:r>
+      <w:r>
+        <w:rPr>
+          <w:lang w:val="en-US"/>
+        </w:rPr>
+        <w:t>, CourseService manages th</w:t>
+      </w:r>
+      <w:r>
+        <w:rPr>
+          <w:lang w:val="en-US"/>
+        </w:rPr>
+        <w:t>at</w:t>
+      </w:r>
+      <w:r>
+        <w:rPr>
+          <w:lang w:val="en-US"/>
+        </w:rPr>
+        <w:t xml:space="preserve"> data</w:t>
+      </w:r>
+      <w:r>
+        <w:rPr>
+          <w:lang w:val="en-US"/>
+        </w:rPr>
+        <w:t>, and the Razor files</w:t>
+      </w:r>
+      <w:r>
+        <w:rPr>
+          <w:lang w:val="en-US"/>
+        </w:rPr>
+        <w:t xml:space="preserve"> provide the </w:t>
+      </w:r>
+      <w:r>
+        <w:rPr>
+          <w:lang w:val="en-US"/>
+        </w:rPr>
+        <w:t>user interface</w:t>
+      </w:r>
+      <w:r>
+        <w:rPr>
+          <w:lang w:val="en-US"/>
+        </w:rPr>
+        <w:t xml:space="preserve"> through which the user interacts with it.</w:t>
       </w:r>
     </w:p>
     <w:sectPr>

</xml_diff>